<commit_message>
Add a screenshot to Lab 8 Step 9 (DNS allowance in an egress policy)
Captured on a Cilium 1.20.1 kind cluster with Hubble: after adding the DNS
rule the Service resolves and returns http=200, and Hubble shows the request
and response FORWARDED through the DNS proxy with the query name and the
answer visible.

Co-Authored-By: Claude Opus 5 <noreply@anthropic.com>
</commit_message>
<xml_diff>
--- a/day-1-internals-and-networking/lab-08-cilium-hubble.docx
+++ b/day-1-internals-and-networking/lab-08-cilium-hubble.docx
@@ -2,14 +2,6 @@
 <file path=word/document.xml><?xml version="1.0" encoding="utf-8"?>
 <w:document xmlns:w="http://schemas.openxmlformats.org/wordprocessingml/2006/main" xmlns:m="http://schemas.openxmlformats.org/officeDocument/2006/math" xmlns:r="http://schemas.openxmlformats.org/officeDocument/2006/relationships" xmlns:o="urn:schemas-microsoft-com:office:office" xmlns:v="urn:schemas-microsoft-com:vml" xmlns:w10="urn:schemas-microsoft-com:office:word" xmlns:a="http://schemas.openxmlformats.org/drawingml/2006/main" xmlns:pic="http://schemas.openxmlformats.org/drawingml/2006/picture" xmlns:wp="http://schemas.openxmlformats.org/drawingml/2006/wordprocessingDrawing">
   <w:body>
-    <w:p>
-      <w:pPr>
-        <w:pStyle w:val="Title"/>
-      </w:pPr>
-      <w:r>
-        <w:t xml:space="preserve">Lab 8 — Trace a Blocked Network Flow to the Exact Policy (Cilium &amp; Hubble)</w:t>
-      </w:r>
-    </w:p>
     <w:p>
       <w:pPr>
         <w:pStyle w:val="Author"/>
@@ -5771,7 +5763,7 @@
       </w:r>
     </w:p>
     <w:bookmarkEnd w:id="48"/>
-    <w:bookmarkStart w:id="49" w:name="step-9--add-the-rule-everyone-forgets"/>
+    <w:bookmarkStart w:id="52" w:name="step-9--add-the-rule-everyone-forgets"/>
     <w:p>
       <w:pPr>
         <w:pStyle w:val="Heading2"/>
@@ -6302,6 +6294,53 @@
     <w:p>
       <w:pPr>
         <w:pStyle w:val="FirstParagraph"/>
+      </w:pPr>
+      <w:r>
+        <w:drawing>
+          <wp:inline>
+            <wp:extent cx="5943600" cy="1018516"/>
+            <wp:effectExtent b="0" l="0" r="0" t="0"/>
+            <wp:docPr descr="The fix in place: the Service resolves and returns http=200, and Hubble now shows the DNS request and response FORWARDED through the proxy with the query name and answer visible" title="" id="50" name="Picture"/>
+            <a:graphic>
+              <a:graphicData uri="http://schemas.openxmlformats.org/drawingml/2006/picture">
+                <pic:pic>
+                  <pic:nvPicPr>
+                    <pic:cNvPr descr="../artifacts/lab-08/screenshots/09-dns-allowed-and-named.png" id="51" name="Picture"/>
+                    <pic:cNvPicPr>
+                      <a:picLocks noChangeArrowheads="1" noChangeAspect="1"/>
+                    </pic:cNvPicPr>
+                  </pic:nvPicPr>
+                  <pic:blipFill>
+                    <a:blip r:embed="rId49"/>
+                    <a:stretch>
+                      <a:fillRect/>
+                    </a:stretch>
+                  </pic:blipFill>
+                  <pic:spPr bwMode="auto">
+                    <a:xfrm>
+                      <a:off x="0" y="0"/>
+                      <a:ext cx="5943600" cy="1018516"/>
+                    </a:xfrm>
+                    <a:prstGeom prst="rect">
+                      <a:avLst/>
+                    </a:prstGeom>
+                    <a:noFill/>
+                    <a:ln w="9525">
+                      <a:noFill/>
+                      <a:headEnd/>
+                      <a:tailEnd/>
+                    </a:ln>
+                  </pic:spPr>
+                </pic:pic>
+              </a:graphicData>
+            </a:graphic>
+          </wp:inline>
+        </w:drawing>
+      </w:r>
+    </w:p>
+    <w:p>
+      <w:pPr>
+        <w:pStyle w:val="BodyText"/>
       </w:pPr>
       <w:r>
         <w:rPr>
@@ -6455,8 +6494,8 @@
         </w:pict>
       </w:r>
     </w:p>
-    <w:bookmarkEnd w:id="49"/>
-    <w:bookmarkStart w:id="50" w:name="step-10--clean-up"/>
+    <w:bookmarkEnd w:id="52"/>
+    <w:bookmarkStart w:id="53" w:name="step-10--clean-up"/>
     <w:p>
       <w:pPr>
         <w:pStyle w:val="Heading2"/>
@@ -6501,8 +6540,8 @@
         </w:pict>
       </w:r>
     </w:p>
-    <w:bookmarkEnd w:id="50"/>
-    <w:bookmarkStart w:id="51" w:name="what-you-learned"/>
+    <w:bookmarkEnd w:id="53"/>
+    <w:bookmarkStart w:id="54" w:name="what-you-learned"/>
     <w:p>
       <w:pPr>
         <w:pStyle w:val="Heading2"/>
@@ -7112,8 +7151,8 @@
         </w:tc>
       </w:tr>
     </w:tbl>
-    <w:bookmarkEnd w:id="51"/>
-    <w:bookmarkStart w:id="57" w:name="evidence"/>
+    <w:bookmarkEnd w:id="54"/>
+    <w:bookmarkStart w:id="60" w:name="evidence"/>
     <w:p>
       <w:pPr>
         <w:pStyle w:val="Heading2"/>
@@ -7132,7 +7171,7 @@
       <w:r>
         <w:t xml:space="preserve"> </w:t>
       </w:r>
-      <w:hyperlink r:id="rId52">
+      <w:hyperlink r:id="rId55">
         <w:r>
           <w:rPr>
             <w:rStyle w:val="VerbatimChar"/>
@@ -7146,7 +7185,7 @@
       <w:r>
         <w:t xml:space="preserve"> </w:t>
       </w:r>
-      <w:hyperlink r:id="rId53">
+      <w:hyperlink r:id="rId56">
         <w:r>
           <w:rPr>
             <w:rStyle w:val="VerbatimChar"/>
@@ -7166,7 +7205,7 @@
           <w:numId w:val="1005"/>
         </w:numPr>
       </w:pPr>
-      <w:hyperlink r:id="rId54">
+      <w:hyperlink r:id="rId57">
         <w:r>
           <w:rPr>
             <w:rStyle w:val="VerbatimChar"/>
@@ -7189,7 +7228,7 @@
           <w:numId w:val="1005"/>
         </w:numPr>
       </w:pPr>
-      <w:hyperlink r:id="rId55">
+      <w:hyperlink r:id="rId58">
         <w:r>
           <w:rPr>
             <w:rStyle w:val="VerbatimChar"/>
@@ -7262,7 +7301,7 @@
       <w:r>
         <w:t xml:space="preserve"> </w:t>
       </w:r>
-      <w:hyperlink r:id="rId56">
+      <w:hyperlink r:id="rId59">
         <w:r>
           <w:rPr>
             <w:rStyle w:val="Hyperlink"/>
@@ -7271,7 +7310,7 @@
         </w:r>
       </w:hyperlink>
     </w:p>
-    <w:bookmarkEnd w:id="57"/>
+    <w:bookmarkEnd w:id="60"/>
     <w:sectPr>
       <w:pgSz w:h="15840" w:w="12240"/>
       <w:pgMar w:bottom="1440" w:footer="720" w:gutter="0" w:header="720" w:left="1440" w:right="1440" w:top="1440"/>

</xml_diff>